<commit_message>
Oracle HR Schema JOIN
</commit_message>
<xml_diff>
--- a/Oracle HR Schema JOIN.docx
+++ b/Oracle HR Schema JOIN.docx
@@ -4090,6 +4090,1002 @@
       </w:pPr>
       <w:r>
         <w:t>6.</w:t>
+      </w:r>
+      <w:r>
+        <w:t xml:space="preserve"> </w:t>
+      </w:r>
+      <w:r>
+        <w:t>--Employee, Job Title, Department, City and Country</w:t>
+      </w:r>
+    </w:p>
+    <w:p>
+      <w:pPr>
+        <w:ind w:firstLine="720"/>
+      </w:pPr>
+      <w:r>
+        <w:t>SELECT E.EMPLOYEE_ID,</w:t>
+      </w:r>
+    </w:p>
+    <w:p>
+      <w:pPr>
+        <w:ind w:firstLine="720"/>
+      </w:pPr>
+      <w:r>
+        <w:t xml:space="preserve">       E.FIRST_NAME || ' ' || E.LAST_NAME    AS Full_Name,</w:t>
+      </w:r>
+    </w:p>
+    <w:p>
+      <w:pPr>
+        <w:ind w:firstLine="720"/>
+      </w:pPr>
+      <w:r>
+        <w:t xml:space="preserve">       J.JOB_TITLE,</w:t>
+      </w:r>
+    </w:p>
+    <w:p>
+      <w:pPr>
+        <w:ind w:firstLine="720"/>
+      </w:pPr>
+      <w:r>
+        <w:t xml:space="preserve">       D.DEPARTMENT_NAME,</w:t>
+      </w:r>
+    </w:p>
+    <w:p>
+      <w:pPr>
+        <w:ind w:firstLine="720"/>
+      </w:pPr>
+      <w:r>
+        <w:t xml:space="preserve">       L.CITY,</w:t>
+      </w:r>
+    </w:p>
+    <w:p>
+      <w:pPr>
+        <w:ind w:firstLine="720"/>
+      </w:pPr>
+      <w:r>
+        <w:t xml:space="preserve">       C.COUNTRY_NAME</w:t>
+      </w:r>
+    </w:p>
+    <w:p>
+      <w:pPr>
+        <w:ind w:firstLine="720"/>
+      </w:pPr>
+      <w:r>
+        <w:t>FROM EMPLOYEES   E</w:t>
+      </w:r>
+    </w:p>
+    <w:p>
+      <w:pPr>
+        <w:ind w:firstLine="720"/>
+      </w:pPr>
+      <w:r>
+        <w:t>JOIN JOBS        J ON E.JOB_ID        = J.JOB_ID</w:t>
+      </w:r>
+    </w:p>
+    <w:p>
+      <w:pPr>
+        <w:ind w:firstLine="720"/>
+      </w:pPr>
+      <w:r>
+        <w:t>JOIN DEPARTMENTS D ON E.DEPARTMENT_ID = D.DEPARTMENT_ID</w:t>
+      </w:r>
+    </w:p>
+    <w:p>
+      <w:pPr>
+        <w:ind w:firstLine="720"/>
+      </w:pPr>
+      <w:r>
+        <w:lastRenderedPageBreak/>
+        <w:t>JOIN LOCATIONS   L ON D.LOCATION_ID   = L.LOCATION_ID</w:t>
+      </w:r>
+    </w:p>
+    <w:p>
+      <w:pPr>
+        <w:ind w:firstLine="720"/>
+      </w:pPr>
+      <w:r>
+        <w:t>JOIN COUNTRIES   C ON L.COUNTRY_ID    = C.COUNTRY_ID</w:t>
+      </w:r>
+    </w:p>
+    <w:p>
+      <w:pPr>
+        <w:ind w:firstLine="720"/>
+      </w:pPr>
+      <w:r>
+        <w:t>ORDER BY C.COUNTRY_NAME,</w:t>
+      </w:r>
+    </w:p>
+    <w:p>
+      <w:pPr>
+        <w:ind w:firstLine="720"/>
+      </w:pPr>
+      <w:r>
+        <w:t xml:space="preserve">         D.DEPARTMENT_NAME,</w:t>
+      </w:r>
+    </w:p>
+    <w:p>
+      <w:pPr>
+        <w:ind w:firstLine="720"/>
+      </w:pPr>
+      <w:r>
+        <w:t xml:space="preserve">         E.LAST_NAME;</w:t>
+      </w:r>
+    </w:p>
+    <w:p>
+      <w:pPr>
+        <w:ind w:firstLine="720"/>
+      </w:pPr>
+    </w:p>
+    <w:p>
+      <w:pPr>
+        <w:ind w:firstLine="720"/>
+      </w:pPr>
+      <w:r>
+        <w:drawing>
+          <wp:inline distT="0" distB="0" distL="0" distR="0" wp14:anchorId="7222D9AA" wp14:editId="43763364">
+            <wp:extent cx="5943600" cy="5402580"/>
+            <wp:effectExtent l="0" t="0" r="0" b="7620"/>
+            <wp:docPr id="1213866982" name="Picture 1"/>
+            <wp:cNvGraphicFramePr>
+              <a:graphicFrameLocks xmlns:a="http://schemas.openxmlformats.org/drawingml/2006/main" noChangeAspect="1"/>
+            </wp:cNvGraphicFramePr>
+            <a:graphic xmlns:a="http://schemas.openxmlformats.org/drawingml/2006/main">
+              <a:graphicData uri="http://schemas.openxmlformats.org/drawingml/2006/picture">
+                <pic:pic xmlns:pic="http://schemas.openxmlformats.org/drawingml/2006/picture">
+                  <pic:nvPicPr>
+                    <pic:cNvPr id="1213866982" name=""/>
+                    <pic:cNvPicPr/>
+                  </pic:nvPicPr>
+                  <pic:blipFill>
+                    <a:blip r:embed="rId34"/>
+                    <a:stretch>
+                      <a:fillRect/>
+                    </a:stretch>
+                  </pic:blipFill>
+                  <pic:spPr>
+                    <a:xfrm>
+                      <a:off x="0" y="0"/>
+                      <a:ext cx="5943600" cy="5402580"/>
+                    </a:xfrm>
+                    <a:prstGeom prst="rect">
+                      <a:avLst/>
+                    </a:prstGeom>
+                  </pic:spPr>
+                </pic:pic>
+              </a:graphicData>
+            </a:graphic>
+          </wp:inline>
+        </w:drawing>
+      </w:r>
+    </w:p>
+    <w:p>
+      <w:pPr>
+        <w:tabs>
+          <w:tab w:val="left" w:pos="3945"/>
+        </w:tabs>
+      </w:pPr>
+      <w:r>
+        <w:tab/>
+      </w:r>
+    </w:p>
+    <w:p>
+      <w:pPr>
+        <w:tabs>
+          <w:tab w:val="left" w:pos="3945"/>
+        </w:tabs>
+      </w:pPr>
+    </w:p>
+    <w:p>
+      <w:pPr>
+        <w:tabs>
+          <w:tab w:val="left" w:pos="3945"/>
+        </w:tabs>
+      </w:pPr>
+    </w:p>
+    <w:p>
+      <w:pPr>
+        <w:tabs>
+          <w:tab w:val="left" w:pos="1170"/>
+        </w:tabs>
+      </w:pPr>
+      <w:r>
+        <w:tab/>
+      </w:r>
+      <w:r>
+        <w:t>--Department, Manager, City, Country INCLUDING departments WITHOUT managers</w:t>
+      </w:r>
+    </w:p>
+    <w:p>
+      <w:pPr>
+        <w:tabs>
+          <w:tab w:val="left" w:pos="1170"/>
+        </w:tabs>
+      </w:pPr>
+      <w:r>
+        <w:t xml:space="preserve"> </w:t>
+      </w:r>
+    </w:p>
+    <w:p>
+      <w:pPr>
+        <w:tabs>
+          <w:tab w:val="left" w:pos="1170"/>
+        </w:tabs>
+      </w:pPr>
+      <w:r>
+        <w:t xml:space="preserve"> SELECT D.DEPARTMENT_ID,</w:t>
+      </w:r>
+    </w:p>
+    <w:p>
+      <w:pPr>
+        <w:tabs>
+          <w:tab w:val="left" w:pos="1170"/>
+        </w:tabs>
+      </w:pPr>
+      <w:r>
+        <w:t xml:space="preserve">       D.DEPARTMENT_NAME,</w:t>
+      </w:r>
+    </w:p>
+    <w:p>
+      <w:pPr>
+        <w:tabs>
+          <w:tab w:val="left" w:pos="1170"/>
+        </w:tabs>
+      </w:pPr>
+      <w:r>
+        <w:t xml:space="preserve">       NVL(E.FIRST_NAME || ' ' || E.LAST_NAME,</w:t>
+      </w:r>
+    </w:p>
+    <w:p>
+      <w:pPr>
+        <w:tabs>
+          <w:tab w:val="left" w:pos="1170"/>
+        </w:tabs>
+      </w:pPr>
+      <w:r>
+        <w:t xml:space="preserve">           'No Manager Assigned')            AS Manager_Name,</w:t>
+      </w:r>
+    </w:p>
+    <w:p>
+      <w:pPr>
+        <w:tabs>
+          <w:tab w:val="left" w:pos="1170"/>
+        </w:tabs>
+      </w:pPr>
+      <w:r>
+        <w:t xml:space="preserve">       NVL(E.JOB_ID,</w:t>
+      </w:r>
+    </w:p>
+    <w:p>
+      <w:pPr>
+        <w:tabs>
+          <w:tab w:val="left" w:pos="1170"/>
+        </w:tabs>
+      </w:pPr>
+      <w:r>
+        <w:t xml:space="preserve">           'N/A')                            AS Manager_Job,</w:t>
+      </w:r>
+    </w:p>
+    <w:p>
+      <w:pPr>
+        <w:tabs>
+          <w:tab w:val="left" w:pos="1170"/>
+        </w:tabs>
+      </w:pPr>
+      <w:r>
+        <w:t xml:space="preserve">       NVL(L.CITY,</w:t>
+      </w:r>
+    </w:p>
+    <w:p>
+      <w:pPr>
+        <w:tabs>
+          <w:tab w:val="left" w:pos="1170"/>
+        </w:tabs>
+      </w:pPr>
+      <w:r>
+        <w:t xml:space="preserve">           'No Location')                    AS City,</w:t>
+      </w:r>
+    </w:p>
+    <w:p>
+      <w:pPr>
+        <w:tabs>
+          <w:tab w:val="left" w:pos="1170"/>
+        </w:tabs>
+      </w:pPr>
+      <w:r>
+        <w:t xml:space="preserve">       NVL(C.COUNTRY_NAME,</w:t>
+      </w:r>
+    </w:p>
+    <w:p>
+      <w:pPr>
+        <w:tabs>
+          <w:tab w:val="left" w:pos="1170"/>
+        </w:tabs>
+      </w:pPr>
+      <w:r>
+        <w:t xml:space="preserve">           'No Country')                     AS Country</w:t>
+      </w:r>
+    </w:p>
+    <w:p>
+      <w:pPr>
+        <w:tabs>
+          <w:tab w:val="left" w:pos="1170"/>
+        </w:tabs>
+      </w:pPr>
+      <w:r>
+        <w:t>FROM DEPARTMENTS D</w:t>
+      </w:r>
+    </w:p>
+    <w:p>
+      <w:pPr>
+        <w:tabs>
+          <w:tab w:val="left" w:pos="1170"/>
+        </w:tabs>
+      </w:pPr>
+      <w:r>
+        <w:t>LEFT JOIN EMPLOYEES  E ON D.MANAGER_ID   = E.EMPLOYEE_ID</w:t>
+      </w:r>
+    </w:p>
+    <w:p>
+      <w:pPr>
+        <w:tabs>
+          <w:tab w:val="left" w:pos="1170"/>
+        </w:tabs>
+      </w:pPr>
+      <w:r>
+        <w:t>LEFT JOIN LOCATIONS  L ON D.LOCATION_ID  = L.LOCATION_ID</w:t>
+      </w:r>
+    </w:p>
+    <w:p>
+      <w:pPr>
+        <w:tabs>
+          <w:tab w:val="left" w:pos="1170"/>
+        </w:tabs>
+      </w:pPr>
+      <w:r>
+        <w:t>LEFT JOIN COUNTRIES  C ON L.COUNTRY_ID   = C.COUNTRY_ID</w:t>
+      </w:r>
+    </w:p>
+    <w:p>
+      <w:pPr>
+        <w:tabs>
+          <w:tab w:val="left" w:pos="1170"/>
+        </w:tabs>
+      </w:pPr>
+      <w:r>
+        <w:t>ORDER BY D.DEPARTMENT_ID;</w:t>
+      </w:r>
+    </w:p>
+    <w:p>
+      <w:pPr>
+        <w:tabs>
+          <w:tab w:val="left" w:pos="1170"/>
+        </w:tabs>
+        <w:rPr>
+          <w:noProof/>
+        </w:rPr>
+      </w:pPr>
+      <w:r>
+        <w:rPr>
+          <w:noProof/>
+        </w:rPr>
+        <w:lastRenderedPageBreak/>
+        <w:drawing>
+          <wp:inline distT="0" distB="0" distL="0" distR="0" wp14:anchorId="01616536" wp14:editId="3D8B3161">
+            <wp:extent cx="8383270" cy="6296660"/>
+            <wp:effectExtent l="0" t="0" r="0" b="8890"/>
+            <wp:docPr id="1712771787" name="Picture 1"/>
+            <wp:cNvGraphicFramePr>
+              <a:graphicFrameLocks xmlns:a="http://schemas.openxmlformats.org/drawingml/2006/main" noChangeAspect="1"/>
+            </wp:cNvGraphicFramePr>
+            <a:graphic xmlns:a="http://schemas.openxmlformats.org/drawingml/2006/main">
+              <a:graphicData uri="http://schemas.openxmlformats.org/drawingml/2006/picture">
+                <pic:pic xmlns:pic="http://schemas.openxmlformats.org/drawingml/2006/picture">
+                  <pic:nvPicPr>
+                    <pic:cNvPr id="0" name="Picture 2"/>
+                    <pic:cNvPicPr>
+                      <a:picLocks noChangeAspect="1" noChangeArrowheads="1"/>
+                    </pic:cNvPicPr>
+                  </pic:nvPicPr>
+                  <pic:blipFill>
+                    <a:blip r:embed="rId35">
+                      <a:extLst>
+                        <a:ext uri="{28A0092B-C50C-407E-A947-70E740481C1C}">
+                          <a14:useLocalDpi xmlns:a14="http://schemas.microsoft.com/office/drawing/2010/main" val="0"/>
+                        </a:ext>
+                      </a:extLst>
+                    </a:blip>
+                    <a:srcRect/>
+                    <a:stretch>
+                      <a:fillRect/>
+                    </a:stretch>
+                  </pic:blipFill>
+                  <pic:spPr bwMode="auto">
+                    <a:xfrm>
+                      <a:off x="0" y="0"/>
+                      <a:ext cx="8383270" cy="6296660"/>
+                    </a:xfrm>
+                    <a:prstGeom prst="rect">
+                      <a:avLst/>
+                    </a:prstGeom>
+                    <a:noFill/>
+                  </pic:spPr>
+                </pic:pic>
+              </a:graphicData>
+            </a:graphic>
+          </wp:inline>
+        </w:drawing>
+      </w:r>
+    </w:p>
+    <w:p>
+      <w:pPr>
+        <w:ind w:firstLine="720"/>
+      </w:pPr>
+    </w:p>
+    <w:p>
+      <w:pPr>
+        <w:ind w:firstLine="720"/>
+      </w:pPr>
+      <w:r>
+        <w:t>--Employees working in the SAME department as their manager</w:t>
+      </w:r>
+    </w:p>
+    <w:p>
+      <w:pPr>
+        <w:ind w:firstLine="720"/>
+      </w:pPr>
+      <w:r>
+        <w:t xml:space="preserve"> SELECT E.EMPLOYEE_ID,</w:t>
+      </w:r>
+    </w:p>
+    <w:p>
+      <w:pPr>
+        <w:ind w:firstLine="720"/>
+      </w:pPr>
+      <w:r>
+        <w:t xml:space="preserve">       E.FIRST_NAME || ' ' || E.LAST_NAME    AS Employee_Name,</w:t>
+      </w:r>
+    </w:p>
+    <w:p>
+      <w:pPr>
+        <w:ind w:firstLine="720"/>
+      </w:pPr>
+      <w:r>
+        <w:t xml:space="preserve">       E.JOB_ID                              AS Employee_Job,</w:t>
+      </w:r>
+    </w:p>
+    <w:p>
+      <w:pPr>
+        <w:ind w:firstLine="720"/>
+      </w:pPr>
+      <w:r>
+        <w:t xml:space="preserve">       E.SALARY                              AS Employee_Salary,</w:t>
+      </w:r>
+    </w:p>
+    <w:p>
+      <w:pPr>
+        <w:ind w:firstLine="720"/>
+      </w:pPr>
+      <w:r>
+        <w:lastRenderedPageBreak/>
+        <w:t xml:space="preserve">       D.DEPARTMENT_NAME,</w:t>
+      </w:r>
+    </w:p>
+    <w:p>
+      <w:pPr>
+        <w:ind w:firstLine="720"/>
+      </w:pPr>
+      <w:r>
+        <w:t xml:space="preserve">       M.FIRST_NAME || ' ' || M.LAST_NAME    AS Manager_Name,</w:t>
+      </w:r>
+    </w:p>
+    <w:p>
+      <w:pPr>
+        <w:ind w:firstLine="720"/>
+      </w:pPr>
+      <w:r>
+        <w:t xml:space="preserve">       M.JOB_ID                              AS Manager_Job</w:t>
+      </w:r>
+    </w:p>
+    <w:p>
+      <w:pPr>
+        <w:ind w:firstLine="720"/>
+      </w:pPr>
+      <w:r>
+        <w:t>FROM EMPLOYEES   E</w:t>
+      </w:r>
+    </w:p>
+    <w:p>
+      <w:pPr>
+        <w:ind w:firstLine="720"/>
+      </w:pPr>
+      <w:r>
+        <w:t>JOIN EMPLOYEES   M ON E.MANAGER_ID    = M.EMPLOYEE_ID</w:t>
+      </w:r>
+    </w:p>
+    <w:p>
+      <w:pPr>
+        <w:ind w:firstLine="720"/>
+      </w:pPr>
+      <w:r>
+        <w:t xml:space="preserve">                  AND E.DEPARTMENT_ID = M.DEPARTMENT_ID</w:t>
+      </w:r>
+    </w:p>
+    <w:p>
+      <w:pPr>
+        <w:ind w:firstLine="720"/>
+      </w:pPr>
+      <w:r>
+        <w:t>JOIN DEPARTMENTS D ON E.DEPARTMENT_ID = D.DEPARTMENT_ID</w:t>
+      </w:r>
+    </w:p>
+    <w:p>
+      <w:pPr>
+        <w:ind w:firstLine="720"/>
+      </w:pPr>
+      <w:r>
+        <w:t>ORDER BY D.DEPARTMENT_NAME,</w:t>
+      </w:r>
+    </w:p>
+    <w:p>
+      <w:pPr>
+        <w:ind w:firstLine="720"/>
+      </w:pPr>
+      <w:r>
+        <w:t xml:space="preserve">         E.LAST_NAME;</w:t>
+      </w:r>
+    </w:p>
+    <w:p>
+      <w:pPr>
+        <w:ind w:firstLine="720"/>
+        <w:rPr>
+          <w:noProof/>
+        </w:rPr>
+      </w:pPr>
+      <w:r>
+        <w:rPr>
+          <w:noProof/>
+        </w:rPr>
+        <w:lastRenderedPageBreak/>
+        <w:drawing>
+          <wp:inline distT="0" distB="0" distL="0" distR="0" wp14:anchorId="181CBF2A" wp14:editId="7A0CB6D8">
+            <wp:extent cx="7887970" cy="7754620"/>
+            <wp:effectExtent l="0" t="0" r="0" b="0"/>
+            <wp:docPr id="1639847024" name="Picture 2"/>
+            <wp:cNvGraphicFramePr>
+              <a:graphicFrameLocks xmlns:a="http://schemas.openxmlformats.org/drawingml/2006/main" noChangeAspect="1"/>
+            </wp:cNvGraphicFramePr>
+            <a:graphic xmlns:a="http://schemas.openxmlformats.org/drawingml/2006/main">
+              <a:graphicData uri="http://schemas.openxmlformats.org/drawingml/2006/picture">
+                <pic:pic xmlns:pic="http://schemas.openxmlformats.org/drawingml/2006/picture">
+                  <pic:nvPicPr>
+                    <pic:cNvPr id="0" name="Picture 3"/>
+                    <pic:cNvPicPr>
+                      <a:picLocks noChangeAspect="1" noChangeArrowheads="1"/>
+                    </pic:cNvPicPr>
+                  </pic:nvPicPr>
+                  <pic:blipFill>
+                    <a:blip r:embed="rId36">
+                      <a:extLst>
+                        <a:ext uri="{28A0092B-C50C-407E-A947-70E740481C1C}">
+                          <a14:useLocalDpi xmlns:a14="http://schemas.microsoft.com/office/drawing/2010/main" val="0"/>
+                        </a:ext>
+                      </a:extLst>
+                    </a:blip>
+                    <a:srcRect/>
+                    <a:stretch>
+                      <a:fillRect/>
+                    </a:stretch>
+                  </pic:blipFill>
+                  <pic:spPr bwMode="auto">
+                    <a:xfrm>
+                      <a:off x="0" y="0"/>
+                      <a:ext cx="7887970" cy="7754620"/>
+                    </a:xfrm>
+                    <a:prstGeom prst="rect">
+                      <a:avLst/>
+                    </a:prstGeom>
+                    <a:noFill/>
+                  </pic:spPr>
+                </pic:pic>
+              </a:graphicData>
+            </a:graphic>
+          </wp:inline>
+        </w:drawing>
+      </w:r>
+    </w:p>
+    <w:p>
+      <w:pPr>
+        <w:tabs>
+          <w:tab w:val="left" w:pos="1110"/>
+        </w:tabs>
+      </w:pPr>
+      <w:r>
+        <w:tab/>
+      </w:r>
+    </w:p>
+    <w:p>
+      <w:pPr>
+        <w:tabs>
+          <w:tab w:val="left" w:pos="1110"/>
+        </w:tabs>
+      </w:pPr>
+      <w:r>
+        <w:lastRenderedPageBreak/>
+        <w:t>--Employees whose managers work in DIFFERENT departments</w:t>
+      </w:r>
+    </w:p>
+    <w:p>
+      <w:pPr>
+        <w:tabs>
+          <w:tab w:val="left" w:pos="1110"/>
+        </w:tabs>
+      </w:pPr>
+      <w:r>
+        <w:t xml:space="preserve"> SELECT E.EMPLOYEE_ID,</w:t>
+      </w:r>
+    </w:p>
+    <w:p>
+      <w:pPr>
+        <w:tabs>
+          <w:tab w:val="left" w:pos="1110"/>
+        </w:tabs>
+      </w:pPr>
+      <w:r>
+        <w:t xml:space="preserve">       E.FIRST_NAME || ' ' || E.LAST_NAME    AS Employee_Name,</w:t>
+      </w:r>
+    </w:p>
+    <w:p>
+      <w:pPr>
+        <w:tabs>
+          <w:tab w:val="left" w:pos="1110"/>
+        </w:tabs>
+      </w:pPr>
+      <w:r>
+        <w:t xml:space="preserve">       E.DEPARTMENT_ID                       AS Employee_Dept_ID,</w:t>
+      </w:r>
+    </w:p>
+    <w:p>
+      <w:pPr>
+        <w:tabs>
+          <w:tab w:val="left" w:pos="1110"/>
+        </w:tabs>
+      </w:pPr>
+      <w:r>
+        <w:t xml:space="preserve">       ED.DEPARTMENT_NAME                    AS Employee_Department,</w:t>
+      </w:r>
+    </w:p>
+    <w:p>
+      <w:pPr>
+        <w:tabs>
+          <w:tab w:val="left" w:pos="1110"/>
+        </w:tabs>
+      </w:pPr>
+      <w:r>
+        <w:t xml:space="preserve">       M.FIRST_NAME || ' ' || M.LAST_NAME    AS Manager_Name,</w:t>
+      </w:r>
+    </w:p>
+    <w:p>
+      <w:pPr>
+        <w:tabs>
+          <w:tab w:val="left" w:pos="1110"/>
+        </w:tabs>
+      </w:pPr>
+      <w:r>
+        <w:t xml:space="preserve">       M.DEPARTMENT_ID                       AS Manager_Dept_ID,</w:t>
+      </w:r>
+    </w:p>
+    <w:p>
+      <w:pPr>
+        <w:tabs>
+          <w:tab w:val="left" w:pos="1110"/>
+        </w:tabs>
+      </w:pPr>
+      <w:r>
+        <w:t xml:space="preserve">       MD.DEPARTMENT_NAME                    AS Manager_Department</w:t>
+      </w:r>
+    </w:p>
+    <w:p>
+      <w:pPr>
+        <w:tabs>
+          <w:tab w:val="left" w:pos="1110"/>
+        </w:tabs>
+      </w:pPr>
+      <w:r>
+        <w:t>FROM EMPLOYEES   E</w:t>
+      </w:r>
+    </w:p>
+    <w:p>
+      <w:pPr>
+        <w:tabs>
+          <w:tab w:val="left" w:pos="1110"/>
+        </w:tabs>
+      </w:pPr>
+      <w:r>
+        <w:t>JOIN EMPLOYEES   M  ON E.MANAGER_ID    = M.EMPLOYEE_ID</w:t>
+      </w:r>
+    </w:p>
+    <w:p>
+      <w:pPr>
+        <w:tabs>
+          <w:tab w:val="left" w:pos="1110"/>
+        </w:tabs>
+      </w:pPr>
+      <w:r>
+        <w:t>JOIN DEPARTMENTS ED ON E.DEPARTMENT_ID = ED.DEPARTMENT_ID</w:t>
+      </w:r>
+    </w:p>
+    <w:p>
+      <w:pPr>
+        <w:tabs>
+          <w:tab w:val="left" w:pos="1110"/>
+        </w:tabs>
+      </w:pPr>
+      <w:r>
+        <w:t>JOIN DEPARTMENTS MD ON M.DEPARTMENT_ID = MD.DEPARTMENT_ID</w:t>
+      </w:r>
+    </w:p>
+    <w:p>
+      <w:pPr>
+        <w:tabs>
+          <w:tab w:val="left" w:pos="1110"/>
+        </w:tabs>
+      </w:pPr>
+      <w:r>
+        <w:t>WHERE E.DEPARTMENT_ID &lt;&gt; M.DEPARTMENT_ID</w:t>
+      </w:r>
+    </w:p>
+    <w:p>
+      <w:pPr>
+        <w:tabs>
+          <w:tab w:val="left" w:pos="1110"/>
+        </w:tabs>
+      </w:pPr>
+      <w:r>
+        <w:t>ORDER BY E.DEPARTMENT_ID,</w:t>
+      </w:r>
+    </w:p>
+    <w:p>
+      <w:pPr>
+        <w:tabs>
+          <w:tab w:val="left" w:pos="1110"/>
+        </w:tabs>
+      </w:pPr>
+      <w:r>
+        <w:t xml:space="preserve">         E.LAST_NAME;</w:t>
+      </w:r>
+    </w:p>
+    <w:p>
+      <w:pPr>
+        <w:tabs>
+          <w:tab w:val="left" w:pos="1110"/>
+        </w:tabs>
+        <w:rPr>
+          <w:noProof/>
+        </w:rPr>
+      </w:pPr>
+      <w:r>
+        <w:rPr>
+          <w:noProof/>
+        </w:rPr>
+        <w:lastRenderedPageBreak/>
+        <w:drawing>
+          <wp:inline distT="0" distB="0" distL="0" distR="0" wp14:anchorId="54C0C29C" wp14:editId="14ED524B">
+            <wp:extent cx="8954770" cy="4858385"/>
+            <wp:effectExtent l="0" t="0" r="0" b="0"/>
+            <wp:docPr id="1011592370" name="Picture 3"/>
+            <wp:cNvGraphicFramePr>
+              <a:graphicFrameLocks xmlns:a="http://schemas.openxmlformats.org/drawingml/2006/main" noChangeAspect="1"/>
+            </wp:cNvGraphicFramePr>
+            <a:graphic xmlns:a="http://schemas.openxmlformats.org/drawingml/2006/main">
+              <a:graphicData uri="http://schemas.openxmlformats.org/drawingml/2006/picture">
+                <pic:pic xmlns:pic="http://schemas.openxmlformats.org/drawingml/2006/picture">
+                  <pic:nvPicPr>
+                    <pic:cNvPr id="0" name="Picture 4"/>
+                    <pic:cNvPicPr>
+                      <a:picLocks noChangeAspect="1" noChangeArrowheads="1"/>
+                    </pic:cNvPicPr>
+                  </pic:nvPicPr>
+                  <pic:blipFill>
+                    <a:blip r:embed="rId37">
+                      <a:extLst>
+                        <a:ext uri="{28A0092B-C50C-407E-A947-70E740481C1C}">
+                          <a14:useLocalDpi xmlns:a14="http://schemas.microsoft.com/office/drawing/2010/main" val="0"/>
+                        </a:ext>
+                      </a:extLst>
+                    </a:blip>
+                    <a:srcRect/>
+                    <a:stretch>
+                      <a:fillRect/>
+                    </a:stretch>
+                  </pic:blipFill>
+                  <pic:spPr bwMode="auto">
+                    <a:xfrm>
+                      <a:off x="0" y="0"/>
+                      <a:ext cx="8954770" cy="4858385"/>
+                    </a:xfrm>
+                    <a:prstGeom prst="rect">
+                      <a:avLst/>
+                    </a:prstGeom>
+                    <a:noFill/>
+                  </pic:spPr>
+                </pic:pic>
+              </a:graphicData>
+            </a:graphic>
+          </wp:inline>
+        </w:drawing>
+      </w:r>
+    </w:p>
+    <w:p/>
+    <w:p>
+      <w:pPr>
+        <w:rPr>
+          <w:noProof/>
+        </w:rPr>
+      </w:pPr>
+    </w:p>
+    <w:p>
+      <w:pPr>
+        <w:ind w:firstLine="720"/>
+      </w:pPr>
+      <w:r>
+        <w:t>--Distinct countries containing company departments</w:t>
+      </w:r>
+    </w:p>
+    <w:p>
+      <w:pPr>
+        <w:ind w:firstLine="720"/>
+      </w:pPr>
+      <w:r>
+        <w:t xml:space="preserve"> SELECT DISTINCT</w:t>
+      </w:r>
+    </w:p>
+    <w:p>
+      <w:pPr>
+        <w:ind w:firstLine="720"/>
+      </w:pPr>
+      <w:r>
+        <w:t xml:space="preserve">       C.COUNTRY_ID,</w:t>
+      </w:r>
+    </w:p>
+    <w:p>
+      <w:pPr>
+        <w:ind w:firstLine="720"/>
+      </w:pPr>
+      <w:r>
+        <w:t xml:space="preserve">       C.COUNTRY_NAME,</w:t>
+      </w:r>
+    </w:p>
+    <w:p>
+      <w:pPr>
+        <w:ind w:firstLine="720"/>
+      </w:pPr>
+      <w:r>
+        <w:t xml:space="preserve">       R.REGION_NAME,</w:t>
+      </w:r>
+    </w:p>
+    <w:p>
+      <w:pPr>
+        <w:ind w:firstLine="720"/>
+      </w:pPr>
+      <w:r>
+        <w:t xml:space="preserve">       COUNT(D.DEPARTMENT_ID)</w:t>
+      </w:r>
+    </w:p>
+    <w:p>
+      <w:pPr>
+        <w:ind w:firstLine="720"/>
+      </w:pPr>
+      <w:r>
+        <w:t xml:space="preserve">           OVER (PARTITION BY C.COUNTRY_ID)  AS Total_Departments</w:t>
+      </w:r>
+    </w:p>
+    <w:p>
+      <w:pPr>
+        <w:ind w:firstLine="720"/>
+      </w:pPr>
+      <w:r>
+        <w:t>FROM DEPARTMENTS D</w:t>
+      </w:r>
+    </w:p>
+    <w:p>
+      <w:pPr>
+        <w:ind w:firstLine="720"/>
+      </w:pPr>
+      <w:r>
+        <w:lastRenderedPageBreak/>
+        <w:t>JOIN LOCATIONS   L ON D.LOCATION_ID  = L.LOCATION_ID</w:t>
+      </w:r>
+    </w:p>
+    <w:p>
+      <w:pPr>
+        <w:ind w:firstLine="720"/>
+      </w:pPr>
+      <w:r>
+        <w:t>JOIN COUNTRIES   C ON L.COUNTRY_ID   = C.COUNTRY_ID</w:t>
+      </w:r>
+    </w:p>
+    <w:p>
+      <w:pPr>
+        <w:ind w:firstLine="720"/>
+      </w:pPr>
+      <w:r>
+        <w:t>JOIN REGIONS     R ON C.REGION_ID    = R.REGION_ID</w:t>
+      </w:r>
+    </w:p>
+    <w:p>
+      <w:pPr>
+        <w:ind w:firstLine="720"/>
+      </w:pPr>
+      <w:r>
+        <w:t>ORDER BY R.REGION_NAME,</w:t>
+      </w:r>
+    </w:p>
+    <w:p>
+      <w:pPr>
+        <w:ind w:firstLine="720"/>
+      </w:pPr>
+      <w:r>
+        <w:t xml:space="preserve">         C.COUNTRY_NAME;</w:t>
+      </w:r>
+    </w:p>
+    <w:p>
+      <w:pPr>
+        <w:ind w:firstLine="720"/>
+      </w:pPr>
+    </w:p>
+    <w:p>
+      <w:pPr>
+        <w:ind w:firstLine="720"/>
+      </w:pPr>
+      <w:r>
+        <w:rPr>
+          <w:noProof/>
+        </w:rPr>
+        <w:drawing>
+          <wp:inline distT="0" distB="0" distL="0" distR="0" wp14:anchorId="6E8553DC" wp14:editId="660699CA">
+            <wp:extent cx="5877560" cy="1971675"/>
+            <wp:effectExtent l="0" t="0" r="8890" b="9525"/>
+            <wp:docPr id="1448766508" name="Picture 4"/>
+            <wp:cNvGraphicFramePr>
+              <a:graphicFrameLocks xmlns:a="http://schemas.openxmlformats.org/drawingml/2006/main" noChangeAspect="1"/>
+            </wp:cNvGraphicFramePr>
+            <a:graphic xmlns:a="http://schemas.openxmlformats.org/drawingml/2006/main">
+              <a:graphicData uri="http://schemas.openxmlformats.org/drawingml/2006/picture">
+                <pic:pic xmlns:pic="http://schemas.openxmlformats.org/drawingml/2006/picture">
+                  <pic:nvPicPr>
+                    <pic:cNvPr id="0" name="Picture 5"/>
+                    <pic:cNvPicPr>
+                      <a:picLocks noChangeAspect="1" noChangeArrowheads="1"/>
+                    </pic:cNvPicPr>
+                  </pic:nvPicPr>
+                  <pic:blipFill>
+                    <a:blip r:embed="rId38">
+                      <a:extLst>
+                        <a:ext uri="{28A0092B-C50C-407E-A947-70E740481C1C}">
+                          <a14:useLocalDpi xmlns:a14="http://schemas.microsoft.com/office/drawing/2010/main" val="0"/>
+                        </a:ext>
+                      </a:extLst>
+                    </a:blip>
+                    <a:srcRect/>
+                    <a:stretch>
+                      <a:fillRect/>
+                    </a:stretch>
+                  </pic:blipFill>
+                  <pic:spPr bwMode="auto">
+                    <a:xfrm>
+                      <a:off x="0" y="0"/>
+                      <a:ext cx="5877560" cy="1971675"/>
+                    </a:xfrm>
+                    <a:prstGeom prst="rect">
+                      <a:avLst/>
+                    </a:prstGeom>
+                    <a:noFill/>
+                  </pic:spPr>
+                </pic:pic>
+              </a:graphicData>
+            </a:graphic>
+          </wp:inline>
+        </w:drawing>
       </w:r>
     </w:p>
     <w:sectPr>

</xml_diff>